<commit_message>
Renumber supplementary items by first citation in reordered manuscript; update SI, main-text cites and workbook sheets
Co-Authored-By: Claude Sonnet 5.5 <noreply@anthropic.com>
Claude-Session: https://claude.ai/code/session_01Y1g9vByMLTE8eGJ9K81zt6
</commit_message>
<xml_diff>
--- a/Manuscript_AS_reordered.docx
+++ b/Manuscript_AS_reordered.docx
@@ -7056,7 +7056,7 @@
         <w:rPr>
           <w:lang w:val="en-US"/>
         </w:rPr>
-        <w:t xml:space="preserve">2% against the calibration dataset. These results show that the proposed three-parameter framework can closely reproduce the calibration measurements (Section S5). The combination of low calibration error and rapid convergence supports the framework’s potential </w:t>
+        <w:t xml:space="preserve">2% against the calibration dataset. These results show that the proposed three-parameter framework can closely reproduce the calibration measurements (Section S1). The combination of low calibration error and rapid convergence supports the framework’s potential </w:t>
       </w:r>
       <w:r>
         <w:rPr>
@@ -11574,7 +11574,7 @@
           <w:rFonts w:cs="Times New Roman"/>
           <w:lang w:val="en-US"/>
         </w:rPr>
-        <w:t xml:space="preserve">; Section S6), with an RMSE of 0.0159% and a </w:t>
+        <w:t xml:space="preserve">; Section S2), with an RMSE of 0.0159% and a </w:t>
       </w:r>
       <m:oMath>
         <m:sSup>
@@ -12529,7 +12529,7 @@
           <w:rFonts w:cs="Times New Roman"/>
           <w:lang w:val="en-US"/>
         </w:rPr>
-        <w:t xml:space="preserve"> (Table S8)</w:t>
+        <w:t xml:space="preserve"> (Table S2)</w:t>
       </w:r>
       <w:r>
         <w:rPr>
@@ -12973,7 +12973,7 @@
         <w:rPr>
           <w:lang w:val="en-US"/>
         </w:rPr>
-        <w:t xml:space="preserve">, indicating a very strong correlation between the two variables (Figure S9).</w:t>
+        <w:t xml:space="preserve">, indicating a very strong correlation between the two variables (Figure S4).</w:t>
       </w:r>
       <w:r>
         <w:rPr>
@@ -13472,7 +13472,7 @@
         <w:rPr>
           <w:lang w:val="en-US"/>
         </w:rPr>
-        <w:t xml:space="preserve">Because no spatial variation in corrosion kinetics was prescribed, this heterogeneous degradation arose from the coupled effects of geometry, oxygen transport, corrosion-product accumulation, and interface recession. Oxygen availability remained higher along the outward-facing crown surfaces, which were exposed to the surrounding electrolyte and supplied from multiple directions, whereas transport to the inner-curvature regions was progressively restricted by geometric confinement and corrosion-product accumulation (Figure 6b; Section S7).</w:t>
+        <w:t xml:space="preserve">Because no spatial variation in corrosion kinetics was prescribed, this heterogeneous degradation arose from the coupled effects of geometry, oxygen transport, corrosion-product accumulation, and interface recession. Oxygen availability remained higher along the outward-facing crown surfaces, which were exposed to the surrounding electrolyte and supplied from multiple directions, whereas transport to the inner-curvature regions was progressively restricted by geometric confinement and corrosion-product accumulation (Figure 6b; Section S3).</w:t>
       </w:r>
       <w:r>
         <w:rPr>
@@ -14110,7 +14110,7 @@
         <w:rPr>
           <w:lang w:val="en-US"/>
         </w:rPr>
-        <w:t xml:space="preserve">Following the stent-scale analysis, the role of individual geometric features was further isolated using simplified wire configurations (Section S7). Curvature produced only modest differences in cumulative mass loss, although mass loss increased progressively with arc angle and was highest for the 150° arc</w:t>
+        <w:t xml:space="preserve">Following the stent-scale analysis, the role of individual geometric features was further isolated using simplified wire configurations (Section S3). Curvature produced only modest differences in cumulative mass loss, although mass loss increased progressively with arc angle and was highest for the 150° arc</w:t>
       </w:r>
       <w:r>
         <w:rPr>
@@ -14755,7 +14755,7 @@
         <w:rPr>
           <w:lang w:val="en-US"/>
         </w:rPr>
-        <w:t xml:space="preserve">Future developments should incorporate physiologically realistic flow conditions, additional ionic species, multiphase corrosion-product evolution, and spatially heterogeneous electrochemical activity. Extending the framework to Zn alloys will also require accounting for alloying elements, secondary phases, and galvanic interactions. Although the current physics-based simulations remain computationally demanding, the reduced calibrated parameter space, which enabled the sensitivity, calibration and uncertainty analyses (Sections S4–S6), and the geometric and field data stored at each time step provide a strong basis for training surrogate models</w:t>
+        <w:t xml:space="preserve">Future developments should incorporate physiologically realistic flow conditions, additional ionic species, multiphase corrosion-product evolution, and spatially heterogeneous electrochemical activity. Extending the framework to Zn alloys will also require accounting for alloying elements, secondary phases, and galvanic interactions. Although the current physics-based simulations remain computationally demanding, the reduced calibrated parameter space, which enabled the sensitivity, calibration and uncertainty analyses (Sections S1, S2 and S4), and the geometric and field data stored at each time step provide a strong basis for training surrogate models</w:t>
       </w:r>
       <w:r>
         <w:rPr>
@@ -23412,7 +23412,7 @@
           <w:rFonts w:cs="Times New Roman"/>
           <w:lang w:val="en-US"/>
         </w:rPr>
-        <w:t xml:space="preserve"> (Section S1, Supporting Information).</w:t>
+        <w:t xml:space="preserve"> (Section S5, Supporting Information).</w:t>
       </w:r>
     </w:p>
     <w:p>
@@ -23487,7 +23487,7 @@
         <w:rPr>
           <w:lang w:val="en-US"/>
         </w:rPr>
-        <w:t xml:space="preserve">To resolve steep concentration gradients near the corrosion front, distance-based mesh refinement was applied around the metal-electrolyte interface, with progressively coarser elements away from the surface. Mesh convergence analysis identified a final mesh containing 18.9 million tetrahedral elements, for which predicted mass loss changed by less than 1% with further refinement (Section S2)</w:t>
+        <w:t xml:space="preserve">To resolve steep concentration gradients near the corrosion front, distance-based mesh refinement was applied around the metal-electrolyte interface, with progressively coarser elements away from the surface. Mesh convergence analysis identified a final mesh containing 18.9 million tetrahedral elements, for which predicted mass loss changed by less than 1% with further refinement (Section S6)</w:t>
       </w:r>
       <w:r>
         <w:rPr>
@@ -23558,7 +23558,7 @@
           <w:bCs/>
           <w:lang w:val="en-US"/>
         </w:rPr>
-        <w:t>Equation S1</w:t>
+        <w:t xml:space="preserve">Equation S2</w:t>
       </w:r>
       <w:r>
         <w:rPr>
@@ -23572,7 +23572,7 @@
           <w:bCs/>
           <w:lang w:val="en-US"/>
         </w:rPr>
-        <w:t>Equation S2</w:t>
+        <w:t xml:space="preserve">Equation S3</w:t>
       </w:r>
       <w:r>
         <w:rPr>
@@ -23624,7 +23624,7 @@
           <w:bCs/>
           <w:lang w:val="en-US"/>
         </w:rPr>
-        <w:t>Equation S3</w:t>
+        <w:t xml:space="preserve">Equation S4</w:t>
       </w:r>
       <w:r>
         <w:rPr>
@@ -23724,7 +23724,7 @@
           <w:bCs/>
           <w:lang w:val="en-US"/>
         </w:rPr>
-        <w:t xml:space="preserve">Section S3 (Supporting Information) lists the computational parameters</w:t>
+        <w:t xml:space="preserve">Section S7 (Supporting Information) lists the computational parameters</w:t>
       </w:r>
       <w:r>
         <w:rPr>
@@ -23990,7 +23990,7 @@
         <w:rPr>
           <w:lang w:val="en-US"/>
         </w:rPr>
-        <w:t xml:space="preserve"> used published 14-day mass-loss measurements obtained from revised simulated body fluid (r-SBF) immersion experiments reported by Liu et al. [54] (Section S5).</w:t>
+        <w:t xml:space="preserve"> used published 14-day mass-loss measurements obtained from revised simulated body fluid (r-SBF) immersion experiments reported by Liu et al. [54] (Section S1).</w:t>
       </w:r>
       <w:r>
         <w:rPr>

</xml_diff>

<commit_message>
Remove Results overview sentence pointing to Table 3/Methods
Co-Authored-By: Claude Sonnet 5.5 <noreply@anthropic.com>
Claude-Session: https://claude.ai/code/session_01Y1g9vByMLTE8eGJ9K81zt6
</commit_message>
<xml_diff>
--- a/Manuscript_AS_reordered.docx
+++ b/Manuscript_AS_reordered.docx
@@ -1753,82 +1753,6 @@
           <w:lang w:val="en-US"/>
         </w:rPr>
       </w:pPr>
-    </w:p>
-    <w:p>
-      <w:pPr>
-        <w:pStyle w:val="BodyText"/>
-        <w:rPr>
-          <w:lang w:val="en-US"/>
-        </w:rPr>
-      </w:pPr>
-      <w:r>
-        <w:rPr>
-          <w:lang w:val="en-US"/>
-        </w:rPr>
-        <w:t xml:space="preserve">The model parameters are summarized in </w:t>
-      </w:r>
-      <w:r>
-        <w:rPr>
-          <w:b/>
-          <w:bCs/>
-          <w:lang w:val="en-US"/>
-        </w:rPr>
-        <w:fldChar w:fldCharType="begin"/>
-      </w:r>
-      <w:r>
-        <w:rPr>
-          <w:b/>
-          <w:bCs/>
-          <w:lang w:val="en-US"/>
-        </w:rPr>
-        <w:instrText xml:space="preserve"> REF _Ref238635735 \h  \* MERGEFORMAT </w:instrText>
-      </w:r>
-      <w:r>
-        <w:rPr>
-          <w:b/>
-          <w:bCs/>
-          <w:lang w:val="en-US"/>
-        </w:rPr>
-      </w:r>
-      <w:r>
-        <w:rPr>
-          <w:b/>
-          <w:bCs/>
-          <w:lang w:val="en-US"/>
-        </w:rPr>
-        <w:fldChar w:fldCharType="separate"/>
-      </w:r>
-      <w:r>
-        <w:rPr>
-          <w:b/>
-          <w:bCs/>
-          <w:lang w:val="en-US"/>
-        </w:rPr>
-        <w:t xml:space="preserve">Table 3</w:t>
-      </w:r>
-      <w:r>
-        <w:rPr>
-          <w:b/>
-          <w:bCs/>
-          <w:noProof/>
-          <w:lang w:val="en-US"/>
-        </w:rPr>
-        <w:t/>
-      </w:r>
-      <w:r>
-        <w:rPr>
-          <w:b/>
-          <w:bCs/>
-          <w:lang w:val="en-US"/>
-        </w:rPr>
-        <w:fldChar w:fldCharType="end"/>
-      </w:r>
-      <w:r>
-        <w:rPr>
-          <w:lang w:val="en-US"/>
-        </w:rPr>
-        <w:t xml:space="preserve">; the experimental procedure, model formulation, numerical implementation, and calibration are described in the Methods.</w:t>
-      </w:r>
     </w:p>
     <w:p>
       <w:pPr>

</xml_diff>